<commit_message>
Rebuild the committed static output
Pages currently has both delivery paths active: the workflow build and the
legacy branch build both fire on push. Keeping the checked-in output in
sync with source means the published site is correct under either.

Co-Authored-By: Claude Opus 5 <noreply@anthropic.com>
</commit_message>
<xml_diff>
--- a/cv/Sergey_Senchenko_CV.docx
+++ b/cv/Sergey_Senchenko_CV.docx
@@ -27,7 +27,7 @@
           <w:color w:val="9D1C1C"/>
           <w:sz w:val="23"/>
         </w:rPr>
-        <w:t>Junior Technical Designer | Gameplay Scripter | Level Designer</w:t>
+        <w:t>Technical Designer | Gameplay Scripter | Level Designer</w:t>
       </w:r>
     </w:p>
     <w:p>
@@ -51,9 +51,36 @@
         </w:r>
       </w:hyperlink>
       <w:r>
-        <w:t xml:space="preserve"> | </w:t>
+        <w:br/>
+        <w:t xml:space="preserve">Portfolio: </w:t>
       </w:r>
       <w:hyperlink r:id="rId10">
+        <w:r>
+          <w:rPr>
+            <w:rFonts w:ascii="Calibri" w:hAnsi="Calibri"/>
+            <w:color w:val="6B1D1D"/>
+            <w:sz w:val="19"/>
+          </w:rPr>
+          <w:t>juze1234.github.io</w:t>
+        </w:r>
+      </w:hyperlink>
+      <w:r>
+        <w:t xml:space="preserve"> | LinkedIn: </w:t>
+      </w:r>
+      <w:hyperlink r:id="rId11">
+        <w:r>
+          <w:rPr>
+            <w:rFonts w:ascii="Calibri" w:hAnsi="Calibri"/>
+            <w:color w:val="6B1D1D"/>
+            <w:sz w:val="19"/>
+          </w:rPr>
+          <w:t>linkedin.com/in/sergey-senchenko-951aa837b</w:t>
+        </w:r>
+      </w:hyperlink>
+      <w:r>
+        <w:t xml:space="preserve"> | GitHub: </w:t>
+      </w:r>
+      <w:hyperlink r:id="rId12">
         <w:r>
           <w:rPr>
             <w:rFonts w:ascii="Calibri" w:hAnsi="Calibri"/>
@@ -64,16 +91,16 @@
         </w:r>
       </w:hyperlink>
       <w:r>
-        <w:t xml:space="preserve"> | </w:t>
+        <w:t xml:space="preserve"> | Project videos: </w:t>
       </w:r>
-      <w:hyperlink r:id="rId11">
+      <w:hyperlink r:id="rId13">
         <w:r>
           <w:rPr>
             <w:rFonts w:ascii="Calibri" w:hAnsi="Calibri"/>
             <w:color w:val="6B1D1D"/>
             <w:sz w:val="19"/>
           </w:rPr>
-          <w:t>Project videos</w:t>
+          <w:t>youtube.com/@MetroWARrpOFF</w:t>
         </w:r>
       </w:hyperlink>
     </w:p>
@@ -102,7 +129,7 @@
           <w:color w:val="1C1F20"/>
           <w:sz w:val="18"/>
         </w:rPr>
-        <w:t>Junior technical designer and gameplay scripter with two years of hands-on experience leading development of a multiplayer DayZ project. Experience includes Enforce Script, server-authoritative gameplay systems, data-driven player customization, persistent identity and progression, level design, asset integration, and end-to-end QA. Comfortable owning features from concept through implementation, testing, and player-facing iteration.</w:t>
+        <w:t>Technical designer and gameplay scripter with two years of hands-on experience leading development of a multiplayer DayZ project. Experience includes Enforce Script, server-authoritative gameplay systems, data-driven player customization, persistent identity and progression, level design, asset integration, and end-to-end QA. Comfortable owning features from concept through implementation, testing, and player-facing iteration.</w:t>
       </w:r>
     </w:p>
     <w:p>
@@ -392,6 +419,34 @@
           <w:color w:val="9D1C1C"/>
           <w:sz w:val="23"/>
         </w:rPr>
+        <w:t>EDUCATION</w:t>
+      </w:r>
+    </w:p>
+    <w:p>
+      <w:pPr>
+        <w:spacing w:after="0"/>
+      </w:pPr>
+      <w:r>
+        <w:rPr>
+          <w:rFonts w:ascii="Calibri" w:hAnsi="Calibri" w:eastAsia="Calibri"/>
+          <w:color w:val="1C1F20"/>
+          <w:sz w:val="18"/>
+        </w:rPr>
+        <w:t>Tallinn Polytechnic School (Tallinna Polütehnikum) - IT Specialist</w:t>
+      </w:r>
+    </w:p>
+    <w:p>
+      <w:pPr>
+        <w:pStyle w:val="Heading1"/>
+        <w:keepNext/>
+      </w:pPr>
+      <w:r>
+        <w:rPr>
+          <w:rFonts w:ascii="Calibri" w:hAnsi="Calibri" w:eastAsia="Calibri"/>
+          <w:b/>
+          <w:color w:val="9D1C1C"/>
+          <w:sz w:val="23"/>
+        </w:rPr>
         <w:t>LANGUAGES</w:t>
       </w:r>
     </w:p>
@@ -409,7 +464,7 @@
       </w:r>
     </w:p>
     <w:sectPr>
-      <w:footerReference w:type="default" r:id="rId12"/>
+      <w:footerReference w:type="default" r:id="rId14"/>
       <w:pgSz w:w="12240" w:h="15840"/>
       <w:pgMar w:top="1037" w:right="1181" w:bottom="936" w:left="1181" w:header="504" w:footer="504" w:gutter="0"/>
       <w:cols w:space="720"/>

</xml_diff>

<commit_message>
Rewrite CV in transferable terms and state seven years of experience
The experience bullets read as DayZ-modding insider notes. The worst case
named a third-party mod framework and described the work through it, which
means nothing to a reader outside that scene; it now describes the rail
vehicle by what it does. Same for the rest: platform-specific phrasing
gives way to the underlying gameplay and systems work.

The profile now leads with seven years of development experience rather
than the two years spent on this project, and the stat tile follows. DayZ
stays named once in the role line, since hiding the platform would be
worse than niche.

Co-Authored-By: Claude Opus 5 <noreply@anthropic.com>
</commit_message>
<xml_diff>
--- a/cv/Sergey_Senchenko_CV.docx
+++ b/cv/Sergey_Senchenko_CV.docx
@@ -129,7 +129,7 @@
           <w:color w:val="1C1F20"/>
           <w:sz w:val="18"/>
         </w:rPr>
-        <w:t>Technical designer and gameplay scripter with two years of hands-on experience leading development of a multiplayer DayZ project. Experience includes Enforce Script, server-authoritative gameplay systems, data-driven player customization, persistent identity and progression, level design, asset integration, and end-to-end QA. Comfortable owning features from concept through implementation, testing, and player-facing iteration.</w:t>
+        <w:t>Technical designer and gameplay scripter with seven years of development experience, the last two spent leading a multiplayer survival and roleplay project end to end. Works across server-authoritative gameplay systems, data-driven player customization, persistent identity, progression and economy, level design, asset integration, and hands-on QA. Comfortable owning a feature from concept through implementation, testing, and player-facing iteration.</w:t>
       </w:r>
     </w:p>
     <w:p>
@@ -174,7 +174,7 @@
           <w:color w:val="5E6565"/>
           <w:sz w:val="18"/>
         </w:rPr>
-        <w:t>Independent DayZ project | 2024-Present | Two-person team</w:t>
+        <w:t>Independent multiplayer project on DayZ | 2024-Present | Two-person team</w:t>
       </w:r>
     </w:p>
     <w:p>
@@ -192,7 +192,7 @@
           <w:color w:val="1C1F20"/>
           <w:sz w:val="18"/>
         </w:rPr>
-        <w:t>Lead development across gameplay scripting, technical design, model integration, game design, multiplayer economy, and QA; collaborate with a second developer focused primarily on world and map production.</w:t>
+        <w:t>Lead development across gameplay scripting, technical design, asset integration, game design, in-game economy, and QA; collaborate with a second developer who focuses on world and map production.</w:t>
       </w:r>
     </w:p>
     <w:p>
@@ -210,7 +210,7 @@
           <w:color w:val="1C1F20"/>
           <w:sz w:val="18"/>
         </w:rPr>
-        <w:t>Designed and implemented a config-driven player customization and loadout workflow with real-time preview, persistent profile rules, and server-side eligibility validation.</w:t>
+        <w:t>Designed and implemented a data-driven character loadout system with real-time preview, persistent profile rules, and server-side eligibility validation.</w:t>
       </w:r>
     </w:p>
     <w:p>
@@ -228,7 +228,7 @@
           <w:color w:val="1C1F20"/>
           <w:sz w:val="18"/>
         </w:rPr>
-        <w:t>Built synchronized interactive world systems covering power state, switches, lighting, control panels, player feedback, and gated interactions.</w:t>
+        <w:t>Built synchronized interactive world systems: power networks, switches, lighting circuits, control panels, powered doors, and the player feedback around them.</w:t>
       </w:r>
     </w:p>
     <w:p>
@@ -246,7 +246,7 @@
           <w:color w:val="1C1F20"/>
           <w:sz w:val="18"/>
         </w:rPr>
-        <w:t>Developed persistent player identity, economy, access control, private storage, environmental hazards, and progression-supporting systems.</w:t>
+        <w:t>Developed persistent player identity, in-game economy, access control, private storage, environmental hazards, and progression systems.</w:t>
       </w:r>
     </w:p>
     <w:p>
@@ -264,7 +264,7 @@
           <w:color w:val="1C1F20"/>
           <w:sz w:val="18"/>
         </w:rPr>
-        <w:t>Extended HypeTrain Core for multiplayer node-based traversal through model integration, simulation tuning, custom rail paths, and automatic alignment.</w:t>
+        <w:t>Built a rideable rail vehicle for multiplayer, covering physics tuning, multi-passenger support, custom track layouts, and automatic alignment to valid track nodes.</w:t>
       </w:r>
     </w:p>
     <w:p>
@@ -300,7 +300,7 @@
           <w:color w:val="1C1F20"/>
           <w:sz w:val="18"/>
         </w:rPr>
-        <w:t>Own hands-on QA alongside development: reproduce issues, trace client-server failures, validate configuration edge cases, and iterate systems through multiplayer testing and player feedback.</w:t>
+        <w:t>Own QA alongside development: reproduce issues, trace client-server failures, validate configuration edge cases, and iterate through multiplayer playtests and player feedback.</w:t>
       </w:r>
     </w:p>
     <w:p>
@@ -360,7 +360,7 @@
           <w:color w:val="1C1F20"/>
           <w:sz w:val="18"/>
         </w:rPr>
-        <w:t>Enforce Script; client-server RPC; data persistence; config-driven systems; debugging</w:t>
+        <w:t>Gameplay scripting (Enforce Script); client-server architecture and RPC; data persistence; config-driven systems; debugging</w:t>
       </w:r>
     </w:p>
     <w:p>
@@ -404,7 +404,7 @@
           <w:color w:val="1C1F20"/>
           <w:sz w:val="18"/>
         </w:rPr>
-        <w:t>DayZ Tools; Object Builder; Terrain Builder; Blender; Substance Painter; Adobe Photoshop</w:t>
+        <w:t>Blender; Substance Painter; Adobe Photoshop; DayZ Tools (Object Builder, Terrain Builder)</w:t>
       </w:r>
     </w:p>
     <w:p>

</xml_diff>

<commit_message>
Restore DayZ and Enforce Script references in the CV
The previous pass over-corrected. The actual problem was one bullet built
around a third-party mod framework, not the platform itself; naming DayZ
and Enforce Script is concrete and worth keeping.

Restores the platform in the profile and role line, the original tool
ordering, and model integration wording. The rail-vehicle bullet stays
rewritten in plain terms.

Co-Authored-By: Claude Opus 5 <noreply@anthropic.com>
</commit_message>
<xml_diff>
--- a/cv/Sergey_Senchenko_CV.docx
+++ b/cv/Sergey_Senchenko_CV.docx
@@ -129,7 +129,7 @@
           <w:color w:val="1C1F20"/>
           <w:sz w:val="18"/>
         </w:rPr>
-        <w:t>Technical designer and gameplay scripter with seven years of development experience, the last two spent leading a multiplayer survival and roleplay project end to end. Works across server-authoritative gameplay systems, data-driven player customization, persistent identity, progression and economy, level design, asset integration, and hands-on QA. Comfortable owning a feature from concept through implementation, testing, and player-facing iteration.</w:t>
+        <w:t>Technical designer and gameplay scripter with seven years of development experience, the last two spent leading a multiplayer DayZ project end to end. Works across Enforce Script, server-authoritative gameplay systems, data-driven player customization, persistent identity, progression and economy, level design, asset integration, and hands-on QA. Comfortable owning a feature from concept through implementation, testing, and player-facing iteration.</w:t>
       </w:r>
     </w:p>
     <w:p>
@@ -174,7 +174,7 @@
           <w:color w:val="5E6565"/>
           <w:sz w:val="18"/>
         </w:rPr>
-        <w:t>Independent multiplayer project on DayZ | 2024-Present | Two-person team</w:t>
+        <w:t>Independent DayZ project | 2024-Present | Two-person team</w:t>
       </w:r>
     </w:p>
     <w:p>
@@ -192,7 +192,7 @@
           <w:color w:val="1C1F20"/>
           <w:sz w:val="18"/>
         </w:rPr>
-        <w:t>Lead development across gameplay scripting, technical design, asset integration, game design, in-game economy, and QA; collaborate with a second developer who focuses on world and map production.</w:t>
+        <w:t>Lead development across gameplay scripting, technical design, model integration, game design, multiplayer economy, and QA; collaborate with a second developer who focuses on world and map production.</w:t>
       </w:r>
     </w:p>
     <w:p>
@@ -404,7 +404,7 @@
           <w:color w:val="1C1F20"/>
           <w:sz w:val="18"/>
         </w:rPr>
-        <w:t>Blender; Substance Painter; Adobe Photoshop; DayZ Tools (Object Builder, Terrain Builder)</w:t>
+        <w:t>DayZ Tools; Object Builder; Terrain Builder; Blender; Substance Painter; Adobe Photoshop</w:t>
       </w:r>
     </w:p>
     <w:p>

</xml_diff>

<commit_message>
Add the earlier S.T.A.L.K.E.R. RP role to the CV
Seven years of experience sat in the profile with a single 2024 entry
underneath it, leaving five years unexplained. The earlier project was
also a DayZ mod, so the DayZ and Enforce Script experience is seven years
rather than two; the summary now says so.

Adds a 2019-2024 Gameplay Scripter entry with what the project reached:
300+ community members and a full 80-player server. Tightened the
capability rows and delivery cards in the designed layout to keep it on
one page.

Co-Authored-By: Claude Opus 5 <noreply@anthropic.com>
</commit_message>
<xml_diff>
--- a/cv/Sergey_Senchenko_CV.docx
+++ b/cv/Sergey_Senchenko_CV.docx
@@ -129,7 +129,7 @@
           <w:color w:val="1C1F20"/>
           <w:sz w:val="18"/>
         </w:rPr>
-        <w:t>Technical designer and gameplay scripter with seven years of development experience, the last two spent leading a multiplayer DayZ project end to end. Works across Enforce Script, server-authoritative gameplay systems, data-driven player customization, persistent identity, progression and economy, level design, asset integration, and hands-on QA. Comfortable owning a feature from concept through implementation, testing, and player-facing iteration.</w:t>
+        <w:t>Technical designer and gameplay scripter with seven years building multiplayer gameplay systems on DayZ, the last two leading a project end to end. Works across Enforce Script, server-authoritative gameplay systems, data-driven player customization, persistent identity, progression and economy, level design, asset integration, and hands-on QA. Comfortable owning a feature from concept through implementation, testing, and player-facing iteration.</w:t>
       </w:r>
     </w:p>
     <w:p>
@@ -324,6 +324,72 @@
           <w:sz w:val="17"/>
         </w:rPr>
         <w:t>2 years in development | 900+ community members | Full 80-player server during the latest major test | Next closed beta in preparation</w:t>
+      </w:r>
+    </w:p>
+    <w:p>
+      <w:pPr>
+        <w:pStyle w:val="Heading2"/>
+        <w:spacing w:before="120" w:after="0"/>
+      </w:pPr>
+      <w:r>
+        <w:rPr>
+          <w:rFonts w:ascii="Calibri" w:hAnsi="Calibri" w:eastAsia="Calibri"/>
+          <w:b/>
+          <w:color w:val="1C1F20"/>
+          <w:sz w:val="21"/>
+        </w:rPr>
+        <w:t>Gameplay Scripter - S.T.A.L.K.E.R. RP</w:t>
+      </w:r>
+    </w:p>
+    <w:p>
+      <w:pPr>
+        <w:pStyle w:val="CVMetadata"/>
+        <w:spacing w:after="60"/>
+      </w:pPr>
+      <w:r>
+        <w:rPr>
+          <w:rFonts w:ascii="Calibri" w:hAnsi="Calibri" w:eastAsia="Calibri"/>
+          <w:i/>
+          <w:color w:val="5E6565"/>
+          <w:sz w:val="18"/>
+        </w:rPr>
+        <w:t>Independent DayZ project | 2019-2024</w:t>
+      </w:r>
+    </w:p>
+    <w:p>
+      <w:pPr>
+        <w:keepLines/>
+        <w:numPr>
+          <w:ilvl w:val="0"/>
+          <w:numId w:val="10"/>
+        </w:numPr>
+        <w:spacing w:before="0" w:after="40" w:line="252" w:lineRule="auto"/>
+      </w:pPr>
+      <w:r>
+        <w:rPr>
+          <w:rFonts w:ascii="Calibri" w:hAnsi="Calibri" w:eastAsia="Calibri"/>
+          <w:color w:val="1C1F20"/>
+          <w:sz w:val="18"/>
+        </w:rPr>
+        <w:t>Owned the gameplay scripting for a persistent roleplay server, implementing the project's custom mechanics in Enforce Script.</w:t>
+      </w:r>
+    </w:p>
+    <w:p>
+      <w:pPr>
+        <w:keepLines/>
+        <w:numPr>
+          <w:ilvl w:val="0"/>
+          <w:numId w:val="10"/>
+        </w:numPr>
+        <w:spacing w:before="0" w:after="40" w:line="252" w:lineRule="auto"/>
+      </w:pPr>
+      <w:r>
+        <w:rPr>
+          <w:rFonts w:ascii="Calibri" w:hAnsi="Calibri" w:eastAsia="Calibri"/>
+          <w:color w:val="1C1F20"/>
+          <w:sz w:val="18"/>
+        </w:rPr>
+        <w:t>Reached 300+ community members and ran at the full 80-player server capacity before the project was wound down.</w:t>
       </w:r>
     </w:p>
     <w:p>

</xml_diff>

<commit_message>
Document the radiation, sanity, radio and character-card systems
Read through the mod sources to describe these accurately rather than
generically. The radio work is the strongest of them: a server-side voice
router rebuilds a per-pair mute matrix each tick over the engine proximity
VOIP, so audibility comes from distance, a matching frequency, or a third
party relaying through a radio left on speaker.

Adds them to both CVs and the supporting-systems copy in each language.
Tightened the designed layout again to hold one page, and trimmed the ATS
bullets and margins so it does not spill a second page for one line.

No source code is reproduced; the private-source policy stands.

Co-Authored-By: Claude Opus 5 <noreply@anthropic.com>
</commit_message>
<xml_diff>
--- a/cv/Sergey_Senchenko_CV.docx
+++ b/cv/Sergey_Senchenko_CV.docx
@@ -246,7 +246,61 @@
           <w:color w:val="1C1F20"/>
           <w:sz w:val="18"/>
         </w:rPr>
-        <w:t>Developed persistent player identity, in-game economy, access control, private storage, environmental hazards, and progression systems.</w:t>
+        <w:t>Developed persistent player identity, in-game economy, access control, private storage, roleplay character cards, and progression systems.</w:t>
+      </w:r>
+    </w:p>
+    <w:p>
+      <w:pPr>
+        <w:keepLines/>
+        <w:numPr>
+          <w:ilvl w:val="0"/>
+          <w:numId w:val="10"/>
+        </w:numPr>
+        <w:spacing w:before="0" w:after="40" w:line="252" w:lineRule="auto"/>
+      </w:pPr>
+      <w:r>
+        <w:rPr>
+          <w:rFonts w:ascii="Calibri" w:hAnsi="Calibri" w:eastAsia="Calibri"/>
+          <w:color w:val="1C1F20"/>
+          <w:sz w:val="18"/>
+        </w:rPr>
+        <w:t>Built a radiation layer: server-side contaminated zones with safe-zone overrides, consumable gas-mask filters, and staged unconsciousness and death that reverses once the player is protected. Repurposed the in-game wristwatch into a filter countdown with audible warnings.</w:t>
+      </w:r>
+    </w:p>
+    <w:p>
+      <w:pPr>
+        <w:keepLines/>
+        <w:numPr>
+          <w:ilvl w:val="0"/>
+          <w:numId w:val="10"/>
+        </w:numPr>
+        <w:spacing w:before="0" w:after="40" w:line="252" w:lineRule="auto"/>
+      </w:pPr>
+      <w:r>
+        <w:rPr>
+          <w:rFonts w:ascii="Calibri" w:hAnsi="Calibri" w:eastAsia="Calibri"/>
+          <w:color w:val="1C1F20"/>
+          <w:sz w:val="18"/>
+        </w:rPr>
+        <w:t>Built a sanity system: psychic pressure scaled by distance, view angle and line of sight, resistance earned through kills, and escalating loss of control as sanity falls. Client state syncs only past a change threshold to keep bandwidth down.</w:t>
+      </w:r>
+    </w:p>
+    <w:p>
+      <w:pPr>
+        <w:keepLines/>
+        <w:numPr>
+          <w:ilvl w:val="0"/>
+          <w:numId w:val="10"/>
+        </w:numPr>
+        <w:spacing w:before="0" w:after="40" w:line="252" w:lineRule="auto"/>
+      </w:pPr>
+      <w:r>
+        <w:rPr>
+          <w:rFonts w:ascii="Calibri" w:hAnsi="Calibri" w:eastAsia="Calibri"/>
+          <w:color w:val="1C1F20"/>
+          <w:sz w:val="18"/>
+        </w:rPr>
+        <w:t>Implemented radio voice comms on top of the engine's proximity VOIP: a server-side router recomputes a per-pair mute matrix each tick from position, voice level, tuned frequency and radio state, so players hear each other directly, over a matching channel, or through someone else's radio left on speaker. Supports dual-channel monitoring and radios carried in a backpack.</w:t>
       </w:r>
     </w:p>
     <w:p>

</xml_diff>

<commit_message>
Credit economy balance to the teammate
Economy was claimed outright across the hero copy, the about section, the
contribution list and both CVs. In fact the systems are mine and the
balance is my teammate's, so every mention now says economy systems and
the collaboration lines name balance as his.

Accuracy matters more than usual here: he is the person referring me.

Co-Authored-By: Claude Opus 5 <noreply@anthropic.com>
</commit_message>
<xml_diff>
--- a/cv/Sergey_Senchenko_CV.docx
+++ b/cv/Sergey_Senchenko_CV.docx
@@ -129,7 +129,7 @@
           <w:color w:val="1C1F20"/>
           <w:sz w:val="18"/>
         </w:rPr>
-        <w:t>Technical designer and gameplay scripter with seven years building multiplayer gameplay systems on DayZ, the last two leading a project end to end. Works across Enforce Script, server-authoritative gameplay systems, data-driven player customization, persistent identity, progression and economy, level design, asset integration, and hands-on QA. Comfortable owning a feature from concept through implementation, testing, and player-facing iteration.</w:t>
+        <w:t>Technical designer and gameplay scripter with seven years building multiplayer gameplay systems on DayZ, the last two leading a project end to end. Works across Enforce Script, server-authoritative gameplay systems, data-driven player customization, persistent identity, progression and economy systems, level design, asset integration, and hands-on QA. Comfortable owning a feature from concept through implementation, testing, and player-facing iteration.</w:t>
       </w:r>
     </w:p>
     <w:p>
@@ -192,7 +192,7 @@
           <w:color w:val="1C1F20"/>
           <w:sz w:val="18"/>
         </w:rPr>
-        <w:t>Lead development across gameplay scripting, technical design, model integration, game design, multiplayer economy, and QA; collaborate with a second developer who focuses on world and map production.</w:t>
+        <w:t>Lead development across gameplay scripting, technical design, model integration, game design, economy systems, and QA; collaborate with a second developer who focuses on world, map production, and economy balance.</w:t>
       </w:r>
     </w:p>
     <w:p>
@@ -246,7 +246,7 @@
           <w:color w:val="1C1F20"/>
           <w:sz w:val="18"/>
         </w:rPr>
-        <w:t>Developed persistent player identity, in-game economy, access control, private storage, roleplay character cards, and progression systems.</w:t>
+        <w:t>Developed persistent player identity, trading and economy systems, access control, private storage, roleplay character cards, and progression systems.</w:t>
       </w:r>
     </w:p>
     <w:p>

</xml_diff>